<commit_message>
feat(parrillero-2.2): F2 cerrada — los 11 entregables 2.2 en dl/ y gates D15 en verde
Motor TODO VERDE, calculadora 552/552, 112 arreglos de texto + A4 en los otros 7, docx 11 H1 / 8.120 palabras,
censo 0 defectos, no latinos 0. Mac = VPS byte a byte.

Via: Claude Code
Co-Authored-By: Claude Opus 5.5 <noreply@anthropic.com>
</commit_message>
<xml_diff>
--- a/astro-site/public/dl/plan-negocio-parrillero-asador-eventos/10-experiencias-tematicas-eventos.docx
+++ b/astro-site/public/dl/plan-negocio-parrillero-asador-eventos/10-experiencias-tematicas-eventos.docx
@@ -39,7 +39,7 @@
         <w:spacing w:after="160"/>
       </w:pPr>
       <w:r>
-        <w:t>El mismo equipamiento factura más cuando lo presentas como concepto. Estas 10 experiencias temáticas te permiten ofrecer menús distintos al mismo cliente recurrente, abrir nuevos canales (B2B vs B2C, urbano vs rural, weekend vs corporate weekday) y justificar precios premium por diferenciación. Validadas contra mercado real España 2026 — todas tienen demanda confirmada.</w:t>
+        <w:t>El mismo equipamiento factura más cuando lo presentas como concepto. Estas 10 experiencias temáticas te permiten ofrecer menús distintos al mismo cliente recurrente, abrir nuevos canales (B2B vs B2C, urbano vs rural, weekend vs corporate weekday) y justificar precios premium por diferenciación. La demanda que se indica en cada experiencia es orientativa: compruébala en tu zona antes de apostar por ella. Los tickets van sin IVA y también son orientativos.</w:t>
       </w:r>
     </w:p>
     <w:p>
@@ -194,7 +194,7 @@
         <w:spacing w:after="160"/>
       </w:pPr>
       <w:r>
-        <w:t>B2C 39-55 €/pax · B2B planner 75-130 €/pax</w:t>
+        <w:t>Orientativo, sin IVA: Particular 30-55 €/inv. · Empresa 28-45 €/inv.</w:t>
       </w:r>
     </w:p>
     <w:p>
@@ -296,7 +296,7 @@
         <w:spacing w:after="80"/>
       </w:pPr>
       <w:r>
-        <w:t>Cochinillo segoviano IGP (alternativa)</w:t>
+        <w:t>Cochinillo de Segovia (Marca de Garantía; alternativa)</w:t>
       </w:r>
     </w:p>
     <w:p>
@@ -305,7 +305,7 @@
         <w:spacing w:after="80"/>
       </w:pPr>
       <w:r>
-        <w:t>Acompañamiento: pan de pueblo + ajada gallega + salsa villaroy</w:t>
+        <w:t>Acompañamiento: pan de pueblo + ajada gallega + salsa verde</w:t>
       </w:r>
     </w:p>
     <w:p>
@@ -361,7 +361,7 @@
         <w:spacing w:after="160"/>
       </w:pPr>
       <w:r>
-        <w:t>B2C 50-70 €/pax · B2B 95-150 €/pax</w:t>
+        <w:t>Orientativo, sin IVA: Particular 33-58 €/inv. · Empresa 32-50 €/inv.</w:t>
       </w:r>
     </w:p>
     <w:p>
@@ -519,7 +519,7 @@
         <w:spacing w:after="160"/>
       </w:pPr>
       <w:r>
-        <w:t>B2C 45-60 €/pax · B2B 80-120 €/pax</w:t>
+        <w:t>Orientativo, sin IVA: Particular 28-50 €/inv. · Empresa 26-42 €/inv.</w:t>
       </w:r>
     </w:p>
     <w:p>
@@ -686,7 +686,7 @@
         <w:spacing w:after="160"/>
       </w:pPr>
       <w:r>
-        <w:t>B2B 65-95 €/pax · Show cooking 800-1.200 €/jornada</w:t>
+        <w:t>Orientativo, sin IVA: Empresa 26-42 €/inv. · el show cooking por jornada se presupuesta aparte</w:t>
       </w:r>
     </w:p>
     <w:p>
@@ -759,7 +759,7 @@
         <w:spacing w:after="160"/>
       </w:pPr>
       <w:r>
-        <w:t>Eventos grandes 80-200 pax, celebraciones populares premium, gastronomic experience.</w:t>
+        <w:t>Eventos grandes 80-200 pax, celebraciones populares premium, experiencia gastronómica.</w:t>
       </w:r>
     </w:p>
     <w:p>
@@ -862,7 +862,7 @@
         <w:spacing w:after="160"/>
       </w:pPr>
       <w:r>
-        <w:t>B2C 50-65 €/pax · B2B 75-100 €/pax</w:t>
+        <w:t>Orientativo, sin IVA: Particular 28-50 €/inv. · Empresa 26-42 €/inv.</w:t>
       </w:r>
     </w:p>
     <w:p>
@@ -955,7 +955,7 @@
         <w:spacing w:after="80"/>
       </w:pPr>
       <w:r>
-        <w:t>Lechazo de Castilla DOP en horno de leña</w:t>
+        <w:t>Lechazo de Castilla y León IGP en horno de leña</w:t>
       </w:r>
     </w:p>
     <w:p>
@@ -964,7 +964,7 @@
         <w:spacing w:after="80"/>
       </w:pPr>
       <w:r>
-        <w:t>Cochinillo segoviano IGP</w:t>
+        <w:t>Cochinillo de Segovia (Marca de Garantía)</w:t>
       </w:r>
     </w:p>
     <w:p>
@@ -1029,7 +1029,7 @@
         <w:spacing w:after="160"/>
       </w:pPr>
       <w:r>
-        <w:t>B2C 55-75 €/pax · B2B 90-140 €/pax</w:t>
+        <w:t>Orientativo, sin IVA: Particular 33-58 €/inv. · Empresa 32-50 €/inv.</w:t>
       </w:r>
     </w:p>
     <w:p>
@@ -1140,7 +1140,7 @@
         <w:spacing w:after="80"/>
       </w:pPr>
       <w:r>
-        <w:t>Verduras a la parrilla (calçots, pimientos, calabacín, alcachofas)</w:t>
+        <w:t>Verduras a la parrilla (pimientos, calabacín y berenjena; alcachofas y calçots solo en su temporada, de noviembre a abril)</w:t>
       </w:r>
     </w:p>
     <w:p>
@@ -1158,7 +1158,7 @@
         <w:spacing w:after="80"/>
       </w:pPr>
       <w:r>
-        <w:t>Acompañamiento: ensalada payesa + salsa romesco + alioli</w:t>
+        <w:t>Acompañamiento: ensalada payesa + salsa romesco + alioli (hecho con ovoproducto pasteurizado)</w:t>
       </w:r>
     </w:p>
     <w:p>
@@ -1205,7 +1205,7 @@
         <w:spacing w:after="160"/>
       </w:pPr>
       <w:r>
-        <w:t>B2C 50-70 €/pax · B2B 90-130 €/pax</w:t>
+        <w:t>Orientativo, sin IVA: Particular 29-52 €/inv. · Empresa 28-45 €/inv.</w:t>
       </w:r>
     </w:p>
     <w:p>
@@ -1372,7 +1372,7 @@
         <w:spacing w:after="160"/>
       </w:pPr>
       <w:r>
-        <w:t>B2C 35-50 €/pax · B2B 60-85 €/pax</w:t>
+        <w:t>Orientativo, sin IVA: Particular 24-40 €/inv. · Empresa 24-38 €/inv.</w:t>
       </w:r>
     </w:p>
     <w:p>
@@ -1465,7 +1465,7 @@
         <w:spacing w:after="80"/>
       </w:pPr>
       <w:r>
-        <w:t>Provoletas en parrilla pequeña con flambeado en directo</w:t>
+        <w:t>Provoletas en parrilla pequeña con flambeado en directo (extintor a mano, lejos de los invitados y nunca con alerta de incendios)</w:t>
       </w:r>
     </w:p>
     <w:p>
@@ -1474,7 +1474,7 @@
         <w:spacing w:after="80"/>
       </w:pPr>
       <w:r>
-        <w:t>Chorizos al sarmiento con quemado de orujo</w:t>
+        <w:t>Chorizos al sarmiento con quemado de orujo (con las mismas precauciones)</w:t>
       </w:r>
     </w:p>
     <w:p>
@@ -1530,7 +1530,7 @@
         <w:spacing w:after="160"/>
       </w:pPr>
       <w:r>
-        <w:t>Upsell: 8-15 €/pax adicional · Stand-alone: fee 400-800 € evento</w:t>
+        <w:t>Orientativo, sin IVA: suplemento de 8-15 €/inv. sobre cualquier experiencia · como servicio propio, 35-55 €/inv.</w:t>
       </w:r>
     </w:p>
     <w:p>
@@ -1697,7 +1697,7 @@
         <w:spacing w:after="160"/>
       </w:pPr>
       <w:r>
-        <w:t>B2B empresa 35-65 €/pax + fee producción 300-600 €</w:t>
+        <w:t>Orientativo, sin IVA: Empresa 22-38 €/inv. · la producción se presupuesta aparte</w:t>
       </w:r>
     </w:p>
     <w:p>
@@ -1740,7 +1740,7 @@
         <w:spacing w:after="160"/>
       </w:pPr>
       <w:r>
-        <w:t>Las experiencias se combinan. Aquí tres mix probados que funcionan en eventos reales:</w:t>
+        <w:t>Las experiencias se combinan. Aquí tienes tres combinaciones de ejemplo:</w:t>
       </w:r>
     </w:p>
     <w:p>
@@ -1749,7 +1749,7 @@
         <w:spacing w:after="80"/>
       </w:pPr>
       <w:r>
-        <w:t>Boda finca premium = (9) Show de fuego como cocktail welcome + (2) Asado a la cruz como principal + (6) Asador criollo lechazo opcional. Ticket: 95-130 €/pax.</w:t>
+        <w:t>Boda finca premium = (9) Show de fuego como cocktail welcome + (2) Asado a la cruz como principal + (6) Asador criollo lechazo opcional. Ticket orientativo, sin IVA: 40-70 €/inv.</w:t>
       </w:r>
     </w:p>
     <w:p>
@@ -1758,7 +1758,7 @@
         <w:spacing w:after="80"/>
       </w:pPr>
       <w:r>
-        <w:t>Team building empresa = (10) Brunch parrillero mañana + (4) BBQ texano almuerzo. Ticket: 65-90 €/pax + fee producción 600-900 €.</w:t>
+        <w:t>Team building empresa = (10) Brunch parrillero mañana + (4) BBQ texano almuerzo. Ticket orientativo, sin IVA: 45-65 €/inv. La producción se presupuesta aparte.</w:t>
       </w:r>
     </w:p>
     <w:p>
@@ -1767,11 +1767,11 @@
         <w:spacing w:after="80"/>
       </w:pPr>
       <w:r>
-        <w:t>Boda costa Mallorca = (9) Show de fuego welcome + (7) Parrilla mediterránea + cordero pascual. Ticket: 80-110 €/pax.</w:t>
+        <w:t>Boda costa Mallorca = (9) Show de fuego welcome + (7) Parrilla mediterránea + cordero pascual. Ticket orientativo, sin IVA: 40-65 €/inv.</w:t>
       </w:r>
     </w:p>
     <w:sectPr>
-      <w:pgSz w:w="12240" w:h="15840"/>
+      <w:pgSz w:w="11906" w:h="16838"/>
       <w:pgMar w:top="1247" w:right="1247" w:bottom="1247" w:left="1247" w:header="720" w:footer="720" w:gutter="0"/>
       <w:cols w:space="720"/>
       <w:docGrid w:linePitch="360"/>

</xml_diff>